<commit_message>
craw và tiền xử lí
</commit_message>
<xml_diff>
--- a/docs/Report.docx
+++ b/docs/Report.docx
@@ -572,7 +572,6 @@
           <w:color w:val="002060"/>
           <w:sz w:val="56"/>
           <w:szCs w:val="56"/>
-          <w:lang w:val="es-ES"/>
         </w:rPr>
       </w:pPr>
       <w:r>
@@ -583,7 +582,6 @@
           <w:color w:val="002060"/>
           <w:sz w:val="56"/>
           <w:szCs w:val="56"/>
-          <w:lang w:val="es-ES"/>
         </w:rPr>
         <w:t>BÁO</w:t>
       </w:r>
@@ -607,21 +605,8 @@
           <w:color w:val="002060"/>
           <w:sz w:val="56"/>
           <w:szCs w:val="56"/>
-          <w:lang w:val="es-ES"/>
-        </w:rPr>
-        <w:t>ĐỒ ÁN L</w:t>
-      </w:r>
-      <w:r>
-        <w:rPr>
-          <w:rFonts w:cs="Times New Roman"/>
-          <w:b/>
-          <w:bCs/>
-          <w:color w:val="002060"/>
-          <w:sz w:val="56"/>
-          <w:szCs w:val="56"/>
-          <w:lang w:val="es-ES"/>
-        </w:rPr>
-        <w:t>AB01</w:t>
+        </w:rPr>
+        <w:t>ĐỒ ÁN LAB01</w:t>
       </w:r>
     </w:p>
     <w:p>
@@ -3321,6 +3306,9 @@
       <w:pPr>
         <w:spacing w:line="276" w:lineRule="auto"/>
       </w:pPr>
+      <w:r>
+        <w:t>Phân tích sự ưu tiên của người tiêu dùng Việt Nam đối với mỹ phẩm trong và ngoài nước trên sàn thương mại điện tử Tik</w:t>
+      </w:r>
     </w:p>
     <w:p>
       <w:pPr>
@@ -3535,10 +3523,7 @@
         </w:rPr>
       </w:pPr>
       <w:r>
-        <w:t>4</w:t>
-      </w:r>
-      <w:r>
-        <w:t xml:space="preserve">.2.1. </w:t>
+        <w:t xml:space="preserve">4.2.1. </w:t>
       </w:r>
       <w:r>
         <w:rPr>
@@ -3564,19 +3549,38 @@
         <w:rPr>
           <w:rFonts w:eastAsia="Arial"/>
         </w:rPr>
-        <w:t>4</w:t>
+        <w:t xml:space="preserve">4.2.2. </w:t>
       </w:r>
       <w:r>
         <w:rPr>
           <w:rFonts w:eastAsia="Arial"/>
         </w:rPr>
-        <w:t xml:space="preserve">.2.2. </w:t>
-      </w:r>
-      <w:r>
+        <w:t>Trần Kim Yến</w:t>
+      </w:r>
+    </w:p>
+    <w:p>
+      <w:pPr>
+        <w:spacing w:line="276" w:lineRule="auto"/>
+      </w:pPr>
+    </w:p>
+    <w:p>
+      <w:pPr>
+        <w:pStyle w:val="u3"/>
         <w:rPr>
           <w:rFonts w:eastAsia="Arial"/>
         </w:rPr>
-        <w:t>Trần Kim Yến</w:t>
+      </w:pPr>
+      <w:r>
+        <w:rPr>
+          <w:rFonts w:eastAsia="Arial"/>
+        </w:rPr>
+        <w:t xml:space="preserve">4.2.3. </w:t>
+      </w:r>
+      <w:r>
+        <w:rPr>
+          <w:rFonts w:eastAsia="Arial"/>
+        </w:rPr>
+        <w:t>Nguyễn Thị Trúc Hằng</w:t>
       </w:r>
     </w:p>
     <w:p>
@@ -3595,44 +3599,7 @@
         <w:rPr>
           <w:rFonts w:eastAsia="Arial"/>
         </w:rPr>
-        <w:t>4</w:t>
-      </w:r>
-      <w:r>
-        <w:rPr>
-          <w:rFonts w:eastAsia="Arial"/>
-        </w:rPr>
-        <w:t xml:space="preserve">.2.3. </w:t>
-      </w:r>
-      <w:r>
-        <w:rPr>
-          <w:rFonts w:eastAsia="Arial"/>
-        </w:rPr>
-        <w:t>Nguyễn Thị Trúc Hằng</w:t>
-      </w:r>
-    </w:p>
-    <w:p>
-      <w:pPr>
-        <w:spacing w:line="276" w:lineRule="auto"/>
-      </w:pPr>
-    </w:p>
-    <w:p>
-      <w:pPr>
-        <w:pStyle w:val="u3"/>
-        <w:rPr>
-          <w:rFonts w:eastAsia="Arial"/>
-        </w:rPr>
-      </w:pPr>
-      <w:r>
-        <w:rPr>
-          <w:rFonts w:eastAsia="Arial"/>
-        </w:rPr>
-        <w:t>4</w:t>
-      </w:r>
-      <w:r>
-        <w:rPr>
-          <w:rFonts w:eastAsia="Arial"/>
-        </w:rPr>
-        <w:t xml:space="preserve">.2.4. </w:t>
+        <w:t xml:space="preserve">4.2.4. </w:t>
       </w:r>
       <w:r>
         <w:rPr>

</xml_diff>